<commit_message>
#688 : page de garde modifié (avec plusieurs pages)
</commit_message>
<xml_diff>
--- a/app/assets/attachments/PDG_Examen.docx
+++ b/app/assets/attachments/PDG_Examen.docx
@@ -2,22 +2,81 @@
 <file path=word/document.xml><?xml version="1.0" encoding="utf-8"?>
 <w:document xmlns:wpc="http://schemas.microsoft.com/office/word/2010/wordprocessingCanvas" xmlns:cx="http://schemas.microsoft.com/office/drawing/2014/chartex" xmlns:cx1="http://schemas.microsoft.com/office/drawing/2015/9/8/chartex" xmlns:cx2="http://schemas.microsoft.com/office/drawing/2015/10/21/chartex" xmlns:cx3="http://schemas.microsoft.com/office/drawing/2016/5/9/chartex" xmlns:cx4="http://schemas.microsoft.com/office/drawing/2016/5/10/chartex" xmlns:cx5="http://schemas.microsoft.com/office/drawing/2016/5/11/chartex" xmlns:cx6="http://schemas.microsoft.com/office/drawing/2016/5/12/chartex" xmlns:cx7="http://schemas.microsoft.com/office/drawing/2016/5/13/chartex" xmlns:cx8="http://schemas.microsoft.com/office/drawing/2016/5/14/chartex" xmlns:mc="http://schemas.openxmlformats.org/markup-compatibility/2006" xmlns:aink="http://schemas.microsoft.com/office/drawing/2016/ink" xmlns:am3d="http://schemas.microsoft.com/office/drawing/2017/model3d" xmlns:o="urn:schemas-microsoft-com:office:office" xmlns:oel="http://schemas.microsoft.com/office/2019/extlst" xmlns:r="http://schemas.openxmlformats.org/officeDocument/2006/relationships" xmlns:m="http://schemas.openxmlformats.org/officeDocument/2006/math" xmlns:v="urn:schemas-microsoft-com:vml" xmlns:wp14="http://schemas.microsoft.com/office/word/2010/wordprocessingDrawing" xmlns:wp="http://schemas.openxmlformats.org/drawingml/2006/wordprocessingDrawing" xmlns:w10="urn:schemas-microsoft-com:office:word" xmlns:w="http://schemas.openxmlformats.org/wordprocessingml/2006/main" xmlns:w14="http://schemas.microsoft.com/office/word/2010/wordml" xmlns:w15="http://schemas.microsoft.com/office/word/2012/wordml" xmlns:w16cex="http://schemas.microsoft.com/office/word/2018/wordml/cex" xmlns:w16cid="http://schemas.microsoft.com/office/word/2016/wordml/cid" xmlns:w16="http://schemas.microsoft.com/office/word/2018/wordml" xmlns:w16du="http://schemas.microsoft.com/office/word/2023/wordml/word16du" xmlns:w16sdtdh="http://schemas.microsoft.com/office/word/2020/wordml/sdtdatahash" xmlns:w16sdtfl="http://schemas.microsoft.com/office/word/2024/wordml/sdtformatlock" xmlns:w16se="http://schemas.microsoft.com/office/word/2015/wordml/symex" xmlns:wpg="http://schemas.microsoft.com/office/word/2010/wordprocessingGroup" xmlns:wpi="http://schemas.microsoft.com/office/word/2010/wordprocessingInk" xmlns:wne="http://schemas.microsoft.com/office/word/2006/wordml" xmlns:wps="http://schemas.microsoft.com/office/word/2010/wordprocessingShape" mc:Ignorable="w14 w15 w16se w16cid w16 w16cex w16sdtdh w16sdtfl w16du wp14">
   <w:body>
+    <w:p>
+      <w:r>
+        <w:rPr>
+          <w:noProof/>
+        </w:rPr>
+        <w:drawing>
+          <wp:anchor distT="0" distB="0" distL="114300" distR="114300" simplePos="0" relativeHeight="251658240" behindDoc="0" locked="0" layoutInCell="1" allowOverlap="1" wp14:anchorId="4FB5A604" wp14:editId="3D879FF9">
+            <wp:simplePos x="0" y="0"/>
+            <wp:positionH relativeFrom="column">
+              <wp:posOffset>-506896</wp:posOffset>
+            </wp:positionH>
+            <wp:positionV relativeFrom="paragraph">
+              <wp:posOffset>-496958</wp:posOffset>
+            </wp:positionV>
+            <wp:extent cx="2425148" cy="1389923"/>
+            <wp:effectExtent l="0" t="0" r="0" b="0"/>
+            <wp:wrapNone/>
+            <wp:docPr id="2050049782" name="Image 1"/>
+            <wp:cNvGraphicFramePr>
+              <a:graphicFrameLocks xmlns:a="http://schemas.openxmlformats.org/drawingml/2006/main" noChangeAspect="1"/>
+            </wp:cNvGraphicFramePr>
+            <a:graphic xmlns:a="http://schemas.openxmlformats.org/drawingml/2006/main">
+              <a:graphicData uri="http://schemas.openxmlformats.org/drawingml/2006/picture">
+                <pic:pic xmlns:pic="http://schemas.openxmlformats.org/drawingml/2006/picture">
+                  <pic:nvPicPr>
+                    <pic:cNvPr id="0" name="Picture 1"/>
+                    <pic:cNvPicPr>
+                      <a:picLocks noChangeAspect="1" noChangeArrowheads="1"/>
+                    </pic:cNvPicPr>
+                  </pic:nvPicPr>
+                  <pic:blipFill>
+                    <a:blip r:embed="rId9" cstate="print">
+                      <a:extLst>
+                        <a:ext uri="{28A0092B-C50C-407E-A947-70E740481C1C}">
+                          <a14:useLocalDpi xmlns:a14="http://schemas.microsoft.com/office/drawing/2010/main" val="0"/>
+                        </a:ext>
+                      </a:extLst>
+                    </a:blip>
+                    <a:srcRect/>
+                    <a:stretch>
+                      <a:fillRect/>
+                    </a:stretch>
+                  </pic:blipFill>
+                  <pic:spPr bwMode="auto">
+                    <a:xfrm>
+                      <a:off x="0" y="0"/>
+                      <a:ext cx="2435595" cy="1395910"/>
+                    </a:xfrm>
+                    <a:prstGeom prst="rect">
+                      <a:avLst/>
+                    </a:prstGeom>
+                    <a:noFill/>
+                    <a:ln>
+                      <a:noFill/>
+                    </a:ln>
+                  </pic:spPr>
+                </pic:pic>
+              </a:graphicData>
+            </a:graphic>
+            <wp14:sizeRelH relativeFrom="margin">
+              <wp14:pctWidth>0</wp14:pctWidth>
+            </wp14:sizeRelH>
+            <wp14:sizeRelV relativeFrom="margin">
+              <wp14:pctHeight>0</wp14:pctHeight>
+            </wp14:sizeRelV>
+          </wp:anchor>
+        </w:drawing>
+      </w:r>
+    </w:p>
     <w:p/>
     <w:p/>
     <w:p/>
-    <w:p/>
     <w:p>
       <w:pPr>
         <w:spacing w:line="276" w:lineRule="auto"/>
-        <w:rPr>
-          <w:rFonts w:ascii="Arial" w:eastAsia="Arial" w:hAnsi="Arial" w:cs="Arial"/>
-          <w:color w:val="00386E"/>
-          <w:sz w:val="36"/>
-          <w:szCs w:val="36"/>
-          <w:highlight w:val="yellow"/>
-        </w:rPr>
-      </w:pPr>
-      <w:r>
         <w:rPr>
           <w:rFonts w:ascii="Arial" w:eastAsia="Arial" w:hAnsi="Arial" w:cs="Arial"/>
           <w:b/>
@@ -25,71 +84,10 @@
           <w:color w:val="00386E"/>
           <w:sz w:val="36"/>
           <w:szCs w:val="36"/>
-        </w:rPr>
-        <w:t xml:space="preserve">Master </w:t>
-      </w:r>
-      <w:r>
-        <w:rPr>
-          <w:rFonts w:ascii="Arial" w:eastAsia="Arial" w:hAnsi="Arial" w:cs="Arial"/>
-          <w:b/>
-          <w:bCs/>
-          <w:color w:val="00386E"/>
-          <w:sz w:val="36"/>
-          <w:szCs w:val="36"/>
-          <w:highlight w:val="yellow"/>
-        </w:rPr>
-        <w:t>nom de la mention</w:t>
-      </w:r>
-      <w:r>
-        <w:rPr>
-          <w:rFonts w:ascii="Arial" w:eastAsia="Arial" w:hAnsi="Arial" w:cs="Arial"/>
-          <w:b/>
-          <w:bCs/>
-          <w:color w:val="00386E"/>
-          <w:sz w:val="36"/>
-          <w:szCs w:val="36"/>
-        </w:rPr>
-        <w:t xml:space="preserve"> </w:t>
-      </w:r>
-      <w:r>
-        <w:br/>
-      </w:r>
-      <w:r>
-        <w:rPr>
-          <w:rFonts w:ascii="Arial" w:eastAsia="Arial" w:hAnsi="Arial" w:cs="Arial"/>
-          <w:b/>
-          <w:bCs/>
-          <w:color w:val="00386E"/>
-          <w:sz w:val="36"/>
-          <w:szCs w:val="36"/>
-        </w:rPr>
-        <w:t xml:space="preserve">parcours </w:t>
-      </w:r>
-      <w:r>
-        <w:rPr>
-          <w:rFonts w:ascii="Arial" w:eastAsia="Arial" w:hAnsi="Arial" w:cs="Arial"/>
-          <w:b/>
-          <w:bCs/>
-          <w:color w:val="00386E"/>
-          <w:sz w:val="36"/>
-          <w:szCs w:val="36"/>
-          <w:highlight w:val="yellow"/>
-        </w:rPr>
-        <w:t>nom du parcours</w:t>
-      </w:r>
-      <w:r>
-        <w:br/>
-      </w:r>
-      <w:r>
-        <w:rPr>
-          <w:rFonts w:ascii="Arial" w:eastAsia="Arial" w:hAnsi="Arial" w:cs="Arial"/>
-          <w:color w:val="00386E"/>
-          <w:sz w:val="36"/>
-          <w:szCs w:val="36"/>
-          <w:highlight w:val="yellow"/>
-        </w:rPr>
-        <w:t>Formation continue JB et SOIR</w:t>
-      </w:r>
+          <w:highlight w:val="yellow"/>
+          <w:u w:val="single"/>
+        </w:rPr>
+      </w:pPr>
     </w:p>
     <w:p>
       <w:pPr>
@@ -137,18 +135,51 @@
           <w:rFonts w:ascii="Arial" w:eastAsia="Arial" w:hAnsi="Arial" w:cs="Arial"/>
           <w:b/>
           <w:bCs/>
-          <w:color w:val="00386E"/>
-          <w:sz w:val="36"/>
-          <w:szCs w:val="36"/>
-          <w:highlight w:val="yellow"/>
+          <w:color w:val="000000" w:themeColor="text1"/>
+          <w:sz w:val="36"/>
+          <w:szCs w:val="36"/>
+          <w:highlight w:val="yellow"/>
+        </w:rPr>
+      </w:pPr>
+      <w:r>
+        <w:rPr>
+          <w:rFonts w:ascii="Arial" w:eastAsia="Arial" w:hAnsi="Arial" w:cs="Arial"/>
+          <w:b/>
+          <w:bCs/>
+          <w:color w:val="00386E"/>
+          <w:sz w:val="36"/>
+          <w:szCs w:val="36"/>
           <w:u w:val="single"/>
         </w:rPr>
-      </w:pPr>
+        <w:t>Examen du</w:t>
+      </w:r>
+      <w:r>
+        <w:rPr>
+          <w:rFonts w:ascii="Arial" w:eastAsia="Arial" w:hAnsi="Arial" w:cs="Arial"/>
+          <w:b/>
+          <w:bCs/>
+          <w:color w:val="00386E"/>
+          <w:sz w:val="36"/>
+          <w:szCs w:val="36"/>
+        </w:rPr>
+        <w:t xml:space="preserve"> : </w:t>
+      </w:r>
+      <w:r>
+        <w:rPr>
+          <w:rFonts w:ascii="Arial" w:eastAsia="Arial" w:hAnsi="Arial" w:cs="Arial"/>
+          <w:b/>
+          <w:bCs/>
+          <w:color w:val="00386E"/>
+          <w:sz w:val="36"/>
+          <w:szCs w:val="36"/>
+          <w:highlight w:val="yellow"/>
+        </w:rPr>
+        <w:t>Samedi 3 mars 2026</w:t>
+      </w:r>
     </w:p>
     <w:p>
       <w:pPr>
         <w:spacing w:line="276" w:lineRule="auto"/>
-        <w:jc w:val="center"/>
         <w:rPr>
           <w:rFonts w:ascii="Arial" w:eastAsia="Arial" w:hAnsi="Arial" w:cs="Arial"/>
           <w:b/>
@@ -156,7 +187,6 @@
           <w:color w:val="000000" w:themeColor="text1"/>
           <w:sz w:val="36"/>
           <w:szCs w:val="36"/>
-          <w:highlight w:val="yellow"/>
         </w:rPr>
       </w:pPr>
       <w:r>
@@ -167,10 +197,21 @@
           <w:color w:val="00386E"/>
           <w:sz w:val="36"/>
           <w:szCs w:val="36"/>
-          <w:u w:val="single"/>
-        </w:rPr>
-        <w:t>Examen du</w:t>
-      </w:r>
+        </w:rPr>
+        <w:t xml:space="preserve"> </w:t>
+      </w:r>
+    </w:p>
+    <w:p>
+      <w:pPr>
+        <w:spacing w:line="276" w:lineRule="auto"/>
+        <w:rPr>
+          <w:rFonts w:ascii="Arial" w:eastAsia="Arial" w:hAnsi="Arial" w:cs="Arial"/>
+          <w:color w:val="000000" w:themeColor="text1"/>
+          <w:sz w:val="36"/>
+          <w:szCs w:val="36"/>
+          <w:highlight w:val="yellow"/>
+        </w:rPr>
+      </w:pPr>
       <w:r>
         <w:rPr>
           <w:rFonts w:ascii="Arial" w:eastAsia="Arial" w:hAnsi="Arial" w:cs="Arial"/>
@@ -180,7 +221,7 @@
           <w:sz w:val="36"/>
           <w:szCs w:val="36"/>
         </w:rPr>
-        <w:t xml:space="preserve"> : </w:t>
+        <w:t xml:space="preserve">Master </w:t>
       </w:r>
       <w:r>
         <w:rPr>
@@ -192,12 +233,9 @@
           <w:szCs w:val="36"/>
           <w:highlight w:val="yellow"/>
         </w:rPr>
-        <w:t>Samedi 3 mars 2026</w:t>
-      </w:r>
-    </w:p>
-    <w:p>
-      <w:pPr>
-        <w:spacing w:line="276" w:lineRule="auto"/>
+        <w:t>nom de la mention</w:t>
+      </w:r>
+      <w:r>
         <w:rPr>
           <w:rFonts w:ascii="Arial" w:eastAsia="Arial" w:hAnsi="Arial" w:cs="Arial"/>
           <w:b/>
@@ -206,7 +244,11 @@
           <w:sz w:val="36"/>
           <w:szCs w:val="36"/>
         </w:rPr>
-      </w:pPr>
+        <w:t xml:space="preserve"> </w:t>
+      </w:r>
+      <w:r>
+        <w:br/>
+      </w:r>
       <w:r>
         <w:rPr>
           <w:rFonts w:ascii="Arial" w:eastAsia="Arial" w:hAnsi="Arial" w:cs="Arial"/>
@@ -216,21 +258,63 @@
           <w:sz w:val="36"/>
           <w:szCs w:val="36"/>
         </w:rPr>
-        <w:t xml:space="preserve"> </w:t>
-      </w:r>
-    </w:p>
-    <w:p>
-      <w:pPr>
-        <w:spacing w:line="276" w:lineRule="auto"/>
+        <w:t xml:space="preserve">parcours </w:t>
+      </w:r>
+      <w:r>
         <w:rPr>
           <w:rFonts w:ascii="Arial" w:eastAsia="Arial" w:hAnsi="Arial" w:cs="Arial"/>
           <w:b/>
           <w:bCs/>
+          <w:color w:val="00386E"/>
+          <w:sz w:val="36"/>
+          <w:szCs w:val="36"/>
+          <w:highlight w:val="yellow"/>
+        </w:rPr>
+        <w:t>nom du parcours</w:t>
+      </w:r>
+      <w:r>
+        <w:br/>
+      </w:r>
+      <w:r>
+        <w:rPr>
+          <w:rFonts w:ascii="Arial" w:eastAsia="Arial" w:hAnsi="Arial" w:cs="Arial"/>
+          <w:color w:val="00386E"/>
+          <w:sz w:val="36"/>
+          <w:szCs w:val="36"/>
+          <w:highlight w:val="yellow"/>
+        </w:rPr>
+        <w:t xml:space="preserve">Formation continue JB et </w:t>
+      </w:r>
+      <w:r>
+        <w:rPr>
+          <w:rFonts w:ascii="Arial" w:eastAsia="Arial" w:hAnsi="Arial" w:cs="Arial"/>
+          <w:color w:val="00386E"/>
+          <w:sz w:val="36"/>
+          <w:szCs w:val="36"/>
+          <w:highlight w:val="yellow"/>
+        </w:rPr>
+        <w:t>SOIR</w:t>
+      </w:r>
+    </w:p>
+    <w:p>
+      <w:pPr>
+        <w:spacing w:line="276" w:lineRule="auto"/>
+        <w:rPr>
+          <w:rFonts w:ascii="Arial" w:eastAsia="Arial" w:hAnsi="Arial" w:cs="Arial"/>
           <w:color w:val="000000" w:themeColor="text1"/>
           <w:sz w:val="36"/>
           <w:szCs w:val="36"/>
         </w:rPr>
       </w:pPr>
+      <w:r>
+        <w:rPr>
+          <w:rFonts w:ascii="Arial" w:eastAsia="Arial" w:hAnsi="Arial" w:cs="Arial"/>
+          <w:color w:val="00386E"/>
+          <w:sz w:val="36"/>
+          <w:szCs w:val="36"/>
+        </w:rPr>
+        <w:t xml:space="preserve"> </w:t>
+      </w:r>
     </w:p>
     <w:p>
       <w:pPr>
@@ -466,9 +550,108 @@
         </w:rPr>
       </w:pPr>
     </w:p>
+    <w:p>
+      <w:pPr>
+        <w:rPr>
+          <w:rFonts w:ascii="Arial" w:eastAsia="Arial" w:hAnsi="Arial" w:cs="Arial"/>
+        </w:rPr>
+      </w:pPr>
+      <w:r>
+        <w:rPr>
+          <w:noProof/>
+        </w:rPr>
+        <w:drawing>
+          <wp:anchor distT="0" distB="0" distL="114300" distR="114300" simplePos="0" relativeHeight="251659264" behindDoc="0" locked="0" layoutInCell="1" allowOverlap="1" wp14:anchorId="21AC98AB" wp14:editId="33F0A92C">
+            <wp:simplePos x="0" y="0"/>
+            <wp:positionH relativeFrom="margin">
+              <wp:align>center</wp:align>
+            </wp:positionH>
+            <wp:positionV relativeFrom="paragraph">
+              <wp:posOffset>1174447</wp:posOffset>
+            </wp:positionV>
+            <wp:extent cx="5731200" cy="284400"/>
+            <wp:effectExtent l="0" t="0" r="0" b="1905"/>
+            <wp:wrapNone/>
+            <wp:docPr id="1911270132" name="Image 1"/>
+            <wp:cNvGraphicFramePr>
+              <a:graphicFrameLocks xmlns:a="http://schemas.openxmlformats.org/drawingml/2006/main" noChangeAspect="1"/>
+            </wp:cNvGraphicFramePr>
+            <a:graphic xmlns:a="http://schemas.openxmlformats.org/drawingml/2006/main">
+              <a:graphicData uri="http://schemas.openxmlformats.org/drawingml/2006/picture">
+                <pic:pic xmlns:pic="http://schemas.openxmlformats.org/drawingml/2006/picture">
+                  <pic:nvPicPr>
+                    <pic:cNvPr id="1911270132" name=""/>
+                    <pic:cNvPicPr/>
+                  </pic:nvPicPr>
+                  <pic:blipFill>
+                    <a:blip r:embed="rId10">
+                      <a:extLst>
+                        <a:ext uri="{28A0092B-C50C-407E-A947-70E740481C1C}">
+                          <a14:useLocalDpi xmlns:a14="http://schemas.microsoft.com/office/drawing/2010/main" val="0"/>
+                        </a:ext>
+                      </a:extLst>
+                    </a:blip>
+                    <a:stretch>
+                      <a:fillRect/>
+                    </a:stretch>
+                  </pic:blipFill>
+                  <pic:spPr>
+                    <a:xfrm>
+                      <a:off x="0" y="0"/>
+                      <a:ext cx="5731200" cy="284400"/>
+                    </a:xfrm>
+                    <a:prstGeom prst="rect">
+                      <a:avLst/>
+                    </a:prstGeom>
+                  </pic:spPr>
+                </pic:pic>
+              </a:graphicData>
+            </a:graphic>
+            <wp14:sizeRelH relativeFrom="margin">
+              <wp14:pctWidth>0</wp14:pctWidth>
+            </wp14:sizeRelH>
+            <wp14:sizeRelV relativeFrom="margin">
+              <wp14:pctHeight>0</wp14:pctHeight>
+            </wp14:sizeRelV>
+          </wp:anchor>
+        </w:drawing>
+      </w:r>
+      <w:r>
+        <w:rPr>
+          <w:rFonts w:ascii="Arial" w:eastAsia="Arial" w:hAnsi="Arial" w:cs="Arial"/>
+        </w:rPr>
+        <w:br w:type="page"/>
+      </w:r>
+    </w:p>
+    <w:p>
+      <w:pPr>
+        <w:rPr>
+          <w:rFonts w:ascii="Arial" w:eastAsia="Arial" w:hAnsi="Arial" w:cs="Arial"/>
+        </w:rPr>
+      </w:pPr>
+    </w:p>
+    <w:p>
+      <w:pPr>
+        <w:rPr>
+          <w:rFonts w:ascii="Arial" w:eastAsia="Arial" w:hAnsi="Arial" w:cs="Arial"/>
+        </w:rPr>
+      </w:pPr>
+      <w:r>
+        <w:rPr>
+          <w:rFonts w:ascii="Arial" w:eastAsia="Arial" w:hAnsi="Arial" w:cs="Arial"/>
+        </w:rPr>
+        <w:br w:type="page"/>
+      </w:r>
+      <w:r>
+        <w:rPr>
+          <w:rFonts w:ascii="Arial" w:eastAsia="Arial" w:hAnsi="Arial" w:cs="Arial"/>
+        </w:rPr>
+        <w:lastRenderedPageBreak/>
+        <w:br w:type="page"/>
+      </w:r>
+    </w:p>
     <w:sectPr>
-      <w:headerReference w:type="default" r:id="rId9"/>
-      <w:footerReference w:type="default" r:id="rId10"/>
+      <w:footerReference w:type="default" r:id="rId11"/>
       <w:pgSz w:w="11906" w:h="16838"/>
       <w:pgMar w:top="1440" w:right="1440" w:bottom="1440" w:left="1440" w:header="720" w:footer="720" w:gutter="0"/>
       <w:cols w:space="720"/>
@@ -508,7 +691,89 @@
   <w:p>
     <w:pPr>
       <w:pStyle w:val="Pieddepage"/>
+      <w:jc w:val="right"/>
+      <w:rPr>
+        <w:sz w:val="18"/>
+        <w:szCs w:val="18"/>
+      </w:rPr>
     </w:pPr>
+    <w:r>
+      <w:rPr>
+        <w:sz w:val="18"/>
+        <w:szCs w:val="18"/>
+      </w:rPr>
+      <w:fldChar w:fldCharType="begin"/>
+    </w:r>
+    <w:r>
+      <w:rPr>
+        <w:sz w:val="18"/>
+        <w:szCs w:val="18"/>
+      </w:rPr>
+      <w:instrText>PAGE  \* Arabic  \* MERGEFORMAT</w:instrText>
+    </w:r>
+    <w:r>
+      <w:rPr>
+        <w:sz w:val="18"/>
+        <w:szCs w:val="18"/>
+      </w:rPr>
+      <w:fldChar w:fldCharType="separate"/>
+    </w:r>
+    <w:r>
+      <w:rPr>
+        <w:sz w:val="18"/>
+        <w:szCs w:val="18"/>
+      </w:rPr>
+      <w:t>1</w:t>
+    </w:r>
+    <w:r>
+      <w:rPr>
+        <w:sz w:val="18"/>
+        <w:szCs w:val="18"/>
+      </w:rPr>
+      <w:fldChar w:fldCharType="end"/>
+    </w:r>
+    <w:r>
+      <w:rPr>
+        <w:sz w:val="18"/>
+        <w:szCs w:val="18"/>
+      </w:rPr>
+      <w:t>/</w:t>
+    </w:r>
+    <w:r>
+      <w:rPr>
+        <w:sz w:val="18"/>
+        <w:szCs w:val="18"/>
+      </w:rPr>
+      <w:fldChar w:fldCharType="begin"/>
+    </w:r>
+    <w:r>
+      <w:rPr>
+        <w:sz w:val="18"/>
+        <w:szCs w:val="18"/>
+      </w:rPr>
+      <w:instrText>NUMPAGES  \* Arabic  \* MERGEFORMAT</w:instrText>
+    </w:r>
+    <w:r>
+      <w:rPr>
+        <w:sz w:val="18"/>
+        <w:szCs w:val="18"/>
+      </w:rPr>
+      <w:fldChar w:fldCharType="separate"/>
+    </w:r>
+    <w:r>
+      <w:rPr>
+        <w:sz w:val="18"/>
+        <w:szCs w:val="18"/>
+      </w:rPr>
+      <w:t>2</w:t>
+    </w:r>
+    <w:r>
+      <w:rPr>
+        <w:sz w:val="18"/>
+        <w:szCs w:val="18"/>
+      </w:rPr>
+      <w:fldChar w:fldCharType="end"/>
+    </w:r>
   </w:p>
 </w:ftr>
 </file>
@@ -536,76 +801,6 @@
     </w:p>
   </w:footnote>
 </w:footnotes>
-</file>
-
-<file path=word/header1.xml><?xml version="1.0" encoding="utf-8"?>
-<w:hdr xmlns:wpc="http://schemas.microsoft.com/office/word/2010/wordprocessingCanvas" xmlns:cx="http://schemas.microsoft.com/office/drawing/2014/chartex" xmlns:cx1="http://schemas.microsoft.com/office/drawing/2015/9/8/chartex" xmlns:cx2="http://schemas.microsoft.com/office/drawing/2015/10/21/chartex" xmlns:cx3="http://schemas.microsoft.com/office/drawing/2016/5/9/chartex" xmlns:cx4="http://schemas.microsoft.com/office/drawing/2016/5/10/chartex" xmlns:cx5="http://schemas.microsoft.com/office/drawing/2016/5/11/chartex" xmlns:cx6="http://schemas.microsoft.com/office/drawing/2016/5/12/chartex" xmlns:cx7="http://schemas.microsoft.com/office/drawing/2016/5/13/chartex" xmlns:cx8="http://schemas.microsoft.com/office/drawing/2016/5/14/chartex" xmlns:mc="http://schemas.openxmlformats.org/markup-compatibility/2006" xmlns:aink="http://schemas.microsoft.com/office/drawing/2016/ink" xmlns:am3d="http://schemas.microsoft.com/office/drawing/2017/model3d" xmlns:o="urn:schemas-microsoft-com:office:office" xmlns:oel="http://schemas.microsoft.com/office/2019/extlst" xmlns:r="http://schemas.openxmlformats.org/officeDocument/2006/relationships" xmlns:m="http://schemas.openxmlformats.org/officeDocument/2006/math" xmlns:v="urn:schemas-microsoft-com:vml" xmlns:wp14="http://schemas.microsoft.com/office/word/2010/wordprocessingDrawing" xmlns:wp="http://schemas.openxmlformats.org/drawingml/2006/wordprocessingDrawing" xmlns:w10="urn:schemas-microsoft-com:office:word" xmlns:w="http://schemas.openxmlformats.org/wordprocessingml/2006/main" xmlns:w14="http://schemas.microsoft.com/office/word/2010/wordml" xmlns:w15="http://schemas.microsoft.com/office/word/2012/wordml" xmlns:w16cex="http://schemas.microsoft.com/office/word/2018/wordml/cex" xmlns:w16cid="http://schemas.microsoft.com/office/word/2016/wordml/cid" xmlns:w16="http://schemas.microsoft.com/office/word/2018/wordml" xmlns:w16du="http://schemas.microsoft.com/office/word/2023/wordml/word16du" xmlns:w16sdtdh="http://schemas.microsoft.com/office/word/2020/wordml/sdtdatahash" xmlns:w16sdtfl="http://schemas.microsoft.com/office/word/2024/wordml/sdtformatlock" xmlns:w16se="http://schemas.microsoft.com/office/word/2015/wordml/symex" xmlns:wpg="http://schemas.microsoft.com/office/word/2010/wordprocessingGroup" xmlns:wpi="http://schemas.microsoft.com/office/word/2010/wordprocessingInk" xmlns:wne="http://schemas.microsoft.com/office/word/2006/wordml" xmlns:wps="http://schemas.microsoft.com/office/word/2010/wordprocessingShape" mc:Ignorable="w14 w15 w16se w16cid w16 w16cex w16sdtdh w16sdtfl w16du wp14">
-  <w:p>
-    <w:pPr>
-      <w:pStyle w:val="En-tte"/>
-    </w:pPr>
-    <w:r>
-      <w:rPr>
-        <w:noProof/>
-      </w:rPr>
-      <w:drawing>
-        <wp:anchor distT="0" distB="0" distL="114300" distR="114300" simplePos="0" relativeHeight="251658240" behindDoc="1" locked="0" layoutInCell="1" allowOverlap="1" wp14:anchorId="03685BFF" wp14:editId="533DC375">
-          <wp:simplePos x="0" y="0"/>
-          <wp:positionH relativeFrom="column">
-            <wp:posOffset>-904875</wp:posOffset>
-          </wp:positionH>
-          <wp:positionV relativeFrom="paragraph">
-            <wp:posOffset>-466725</wp:posOffset>
-          </wp:positionV>
-          <wp:extent cx="7559040" cy="10692384"/>
-          <wp:effectExtent l="0" t="0" r="0" b="0"/>
-          <wp:wrapNone/>
-          <wp:docPr id="152290730" name="drawing"/>
-          <wp:cNvGraphicFramePr>
-            <a:graphicFrameLocks xmlns:a="http://schemas.openxmlformats.org/drawingml/2006/main" noChangeAspect="1"/>
-          </wp:cNvGraphicFramePr>
-          <a:graphic xmlns:a="http://schemas.openxmlformats.org/drawingml/2006/main">
-            <a:graphicData uri="http://schemas.openxmlformats.org/drawingml/2006/picture">
-              <pic:pic xmlns:pic="http://schemas.openxmlformats.org/drawingml/2006/picture">
-                <pic:nvPicPr>
-                  <pic:cNvPr id="152290730" name=""/>
-                  <pic:cNvPicPr/>
-                </pic:nvPicPr>
-                <pic:blipFill>
-                  <a:blip r:embed="rId1">
-                    <a:extLst>
-                      <a:ext uri="{28A0092B-C50C-407E-A947-70E740481C1C}">
-                        <a14:useLocalDpi xmlns:a14="http://schemas.microsoft.com/office/drawing/2010/main" val="0"/>
-                      </a:ext>
-                    </a:extLst>
-                  </a:blip>
-                  <a:stretch>
-                    <a:fillRect/>
-                  </a:stretch>
-                </pic:blipFill>
-                <pic:spPr>
-                  <a:xfrm>
-                    <a:off x="0" y="0"/>
-                    <a:ext cx="7559040" cy="10692384"/>
-                  </a:xfrm>
-                  <a:prstGeom prst="rect">
-                    <a:avLst/>
-                  </a:prstGeom>
-                </pic:spPr>
-              </pic:pic>
-            </a:graphicData>
-          </a:graphic>
-          <wp14:sizeRelH relativeFrom="page">
-            <wp14:pctWidth>0</wp14:pctWidth>
-          </wp14:sizeRelH>
-          <wp14:sizeRelV relativeFrom="page">
-            <wp14:pctHeight>0</wp14:pctHeight>
-          </wp14:sizeRelV>
-        </wp:anchor>
-      </w:drawing>
-    </w:r>
-  </w:p>
-</w:hdr>
 </file>
 
 <file path=word/styles.xml><?xml version="1.0" encoding="utf-8"?>
@@ -1051,6 +1246,7 @@
   <w:style w:type="paragraph" w:styleId="Pieddepage">
     <w:name w:val="footer"/>
     <w:basedOn w:val="Normal"/>
+    <w:link w:val="PieddepageCar"/>
     <w:uiPriority w:val="99"/>
     <w:unhideWhenUsed/>
     <w:rsid w:val="360787B9"/>
@@ -1080,6 +1276,13 @@
         <w:insideV w:val="single" w:sz="4" w:space="0" w:color="000000" w:themeColor="text1"/>
       </w:tblBorders>
     </w:tblPr>
+  </w:style>
+  <w:style w:type="character" w:customStyle="1" w:styleId="PieddepageCar">
+    <w:name w:val="Pied de page Car"/>
+    <w:basedOn w:val="Policepardfaut"/>
+    <w:link w:val="Pieddepage"/>
+    <w:uiPriority w:val="99"/>
+    <w:rsid w:val="00735048"/>
   </w:style>
 </w:styles>
 </file>
@@ -1346,18 +1549,9 @@
 </file>
 
 <file path=customXml/item1.xml><?xml version="1.0" encoding="utf-8"?>
-<?mso-contentType ?>
-<FormTemplates xmlns="http://schemas.microsoft.com/sharepoint/v3/contenttype/forms">
-  <Display>DocumentLibraryForm</Display>
-  <Edit>DocumentLibraryForm</Edit>
-  <New>DocumentLibraryForm</New>
-</FormTemplates>
-</file>
-
-<file path=customXml/item2.xml><?xml version="1.0" encoding="utf-8"?>
-<ct:contentTypeSchema xmlns:ct="http://schemas.microsoft.com/office/2006/metadata/contentType" xmlns:ma="http://schemas.microsoft.com/office/2006/metadata/properties/metaAttributes" ct:_="" ma:_="" ma:contentTypeName="Document" ma:contentTypeID="0x0101000B2672FE922F294988AE84DA2BB7A4AD" ma:contentTypeVersion="15" ma:contentTypeDescription="Crée un document." ma:contentTypeScope="" ma:versionID="effbfb9935da414f612b5983d56b1fa8">
-  <xsd:schema xmlns:xsd="http://www.w3.org/2001/XMLSchema" xmlns:xs="http://www.w3.org/2001/XMLSchema" xmlns:p="http://schemas.microsoft.com/office/2006/metadata/properties" xmlns:ns2="ceb1f4d8-00b6-4797-bbe4-8df8d1483779" xmlns:ns3="10d26e31-3e6d-4bc1-8210-254c8b5ddd00" targetNamespace="http://schemas.microsoft.com/office/2006/metadata/properties" ma:root="true" ma:fieldsID="5c712b66b800199e05e07458a78b283d" ns2:_="" ns3:_="">
-    <xsd:import namespace="ceb1f4d8-00b6-4797-bbe4-8df8d1483779"/>
+<ct:contentTypeSchema xmlns:ct="http://schemas.microsoft.com/office/2006/metadata/contentType" xmlns:ma="http://schemas.microsoft.com/office/2006/metadata/properties/metaAttributes" ct:_="" ma:_="" ma:contentTypeName="Document" ma:contentTypeID="0x01010030953F962910174AACE9EB26805CC374" ma:contentTypeVersion="15" ma:contentTypeDescription="Crée un document." ma:contentTypeScope="" ma:versionID="611d63fa7bcfa577ea3ca4d96ee4af4e">
+  <xsd:schema xmlns:xsd="http://www.w3.org/2001/XMLSchema" xmlns:xs="http://www.w3.org/2001/XMLSchema" xmlns:p="http://schemas.microsoft.com/office/2006/metadata/properties" xmlns:ns2="79897123-3b52-4ad2-92b6-660dc1d292e7" xmlns:ns3="10d26e31-3e6d-4bc1-8210-254c8b5ddd00" targetNamespace="http://schemas.microsoft.com/office/2006/metadata/properties" ma:root="true" ma:fieldsID="b1b8101c88dc615b49bdbe9a41ecd489" ns2:_="" ns3:_="">
+    <xsd:import namespace="79897123-3b52-4ad2-92b6-660dc1d292e7"/>
     <xsd:import namespace="10d26e31-3e6d-4bc1-8210-254c8b5ddd00"/>
     <xsd:element name="properties">
       <xsd:complexType>
@@ -1367,18 +1561,18 @@
               <xsd:all>
                 <xsd:element ref="ns2:MediaServiceMetadata" minOccurs="0"/>
                 <xsd:element ref="ns2:MediaServiceFastMetadata" minOccurs="0"/>
+                <xsd:element ref="ns2:MediaServiceSearchProperties" minOccurs="0"/>
+                <xsd:element ref="ns2:MediaServiceObjectDetectorVersions" minOccurs="0"/>
+                <xsd:element ref="ns2:MediaServiceDateTaken" minOccurs="0"/>
+                <xsd:element ref="ns2:MediaServiceGenerationTime" minOccurs="0"/>
+                <xsd:element ref="ns2:MediaServiceEventHashCode" minOccurs="0"/>
+                <xsd:element ref="ns2:MediaLengthInSeconds" minOccurs="0"/>
                 <xsd:element ref="ns2:lcf76f155ced4ddcb4097134ff3c332f" minOccurs="0"/>
                 <xsd:element ref="ns3:TaxCatchAll" minOccurs="0"/>
                 <xsd:element ref="ns2:MediaServiceOCR" minOccurs="0"/>
-                <xsd:element ref="ns2:MediaServiceGenerationTime" minOccurs="0"/>
-                <xsd:element ref="ns2:MediaServiceEventHashCode" minOccurs="0"/>
-                <xsd:element ref="ns3:SharedWithUsers" minOccurs="0"/>
-                <xsd:element ref="ns3:SharedWithDetails" minOccurs="0"/>
-                <xsd:element ref="ns2:MediaServiceObjectDetectorVersions" minOccurs="0"/>
-                <xsd:element ref="ns2:MediaServiceSearchProperties" minOccurs="0"/>
-                <xsd:element ref="ns2:MediaServiceDateTaken" minOccurs="0"/>
                 <xsd:element ref="ns2:MediaServiceLocation" minOccurs="0"/>
-                <xsd:element ref="ns2:MediaLengthInSeconds" minOccurs="0"/>
+                <xsd:element ref="ns2:Commentaire" minOccurs="0"/>
+                <xsd:element ref="ns2:MediaServiceBillingMetadata" minOccurs="0"/>
               </xsd:all>
             </xsd:complexType>
           </xsd:element>
@@ -1386,7 +1580,7 @@
       </xsd:complexType>
     </xsd:element>
   </xsd:schema>
-  <xsd:schema xmlns:xsd="http://www.w3.org/2001/XMLSchema" xmlns:xs="http://www.w3.org/2001/XMLSchema" xmlns:dms="http://schemas.microsoft.com/office/2006/documentManagement/types" xmlns:pc="http://schemas.microsoft.com/office/infopath/2007/PartnerControls" targetNamespace="ceb1f4d8-00b6-4797-bbe4-8df8d1483779" elementFormDefault="qualified">
+  <xsd:schema xmlns:xsd="http://www.w3.org/2001/XMLSchema" xmlns:xs="http://www.w3.org/2001/XMLSchema" xmlns:dms="http://schemas.microsoft.com/office/2006/documentManagement/types" xmlns:pc="http://schemas.microsoft.com/office/infopath/2007/PartnerControls" targetNamespace="79897123-3b52-4ad2-92b6-660dc1d292e7" elementFormDefault="qualified">
     <xsd:import namespace="http://schemas.microsoft.com/office/2006/documentManagement/types"/>
     <xsd:import namespace="http://schemas.microsoft.com/office/infopath/2007/PartnerControls"/>
     <xsd:element name="MediaServiceMetadata" ma:index="8" nillable="true" ma:displayName="MediaServiceMetadata" ma:hidden="true" ma:internalName="MediaServiceMetadata" ma:readOnly="true">
@@ -1399,60 +1593,72 @@
         <xsd:restriction base="dms:Note"/>
       </xsd:simpleType>
     </xsd:element>
-    <xsd:element name="lcf76f155ced4ddcb4097134ff3c332f" ma:index="11" nillable="true" ma:taxonomy="true" ma:internalName="lcf76f155ced4ddcb4097134ff3c332f" ma:taxonomyFieldName="MediaServiceImageTags" ma:displayName="Balises d’images" ma:readOnly="false" ma:fieldId="{5cf76f15-5ced-4ddc-b409-7134ff3c332f}" ma:taxonomyMulti="true" ma:sspId="e52cd025-d351-4196-ab85-e6b23180290e" ma:termSetId="09814cd3-568e-fe90-9814-8d621ff8fb84" ma:anchorId="fba54fb3-c3e1-fe81-a776-ca4b69148c4d" ma:open="true" ma:isKeyword="false">
+    <xsd:element name="MediaServiceSearchProperties" ma:index="10" nillable="true" ma:displayName="MediaServiceSearchProperties" ma:hidden="true" ma:internalName="MediaServiceSearchProperties" ma:readOnly="true">
+      <xsd:simpleType>
+        <xsd:restriction base="dms:Note"/>
+      </xsd:simpleType>
+    </xsd:element>
+    <xsd:element name="MediaServiceObjectDetectorVersions" ma:index="11" nillable="true" ma:displayName="MediaServiceObjectDetectorVersions" ma:hidden="true" ma:indexed="true" ma:internalName="MediaServiceObjectDetectorVersions" ma:readOnly="true">
+      <xsd:simpleType>
+        <xsd:restriction base="dms:Text"/>
+      </xsd:simpleType>
+    </xsd:element>
+    <xsd:element name="MediaServiceDateTaken" ma:index="12" nillable="true" ma:displayName="MediaServiceDateTaken" ma:hidden="true" ma:indexed="true" ma:internalName="MediaServiceDateTaken" ma:readOnly="true">
+      <xsd:simpleType>
+        <xsd:restriction base="dms:Text"/>
+      </xsd:simpleType>
+    </xsd:element>
+    <xsd:element name="MediaServiceGenerationTime" ma:index="13" nillable="true" ma:displayName="MediaServiceGenerationTime" ma:hidden="true" ma:internalName="MediaServiceGenerationTime" ma:readOnly="true">
+      <xsd:simpleType>
+        <xsd:restriction base="dms:Text"/>
+      </xsd:simpleType>
+    </xsd:element>
+    <xsd:element name="MediaServiceEventHashCode" ma:index="14" nillable="true" ma:displayName="MediaServiceEventHashCode" ma:hidden="true" ma:internalName="MediaServiceEventHashCode" ma:readOnly="true">
+      <xsd:simpleType>
+        <xsd:restriction base="dms:Text"/>
+      </xsd:simpleType>
+    </xsd:element>
+    <xsd:element name="MediaLengthInSeconds" ma:index="15" nillable="true" ma:displayName="MediaLengthInSeconds" ma:hidden="true" ma:internalName="MediaLengthInSeconds" ma:readOnly="true">
+      <xsd:simpleType>
+        <xsd:restriction base="dms:Unknown"/>
+      </xsd:simpleType>
+    </xsd:element>
+    <xsd:element name="lcf76f155ced4ddcb4097134ff3c332f" ma:index="17" nillable="true" ma:taxonomy="true" ma:internalName="lcf76f155ced4ddcb4097134ff3c332f" ma:taxonomyFieldName="MediaServiceImageTags" ma:displayName="Balises d’images" ma:readOnly="false" ma:fieldId="{5cf76f15-5ced-4ddc-b409-7134ff3c332f}" ma:taxonomyMulti="true" ma:sspId="e52cd025-d351-4196-ab85-e6b23180290e" ma:termSetId="09814cd3-568e-fe90-9814-8d621ff8fb84" ma:anchorId="fba54fb3-c3e1-fe81-a776-ca4b69148c4d" ma:open="true" ma:isKeyword="false">
       <xsd:complexType>
         <xsd:sequence>
           <xsd:element ref="pc:Terms" minOccurs="0" maxOccurs="1"/>
         </xsd:sequence>
       </xsd:complexType>
     </xsd:element>
-    <xsd:element name="MediaServiceOCR" ma:index="13" nillable="true" ma:displayName="Extracted Text" ma:internalName="MediaServiceOCR" ma:readOnly="true">
+    <xsd:element name="MediaServiceOCR" ma:index="19" nillable="true" ma:displayName="Extracted Text" ma:internalName="MediaServiceOCR" ma:readOnly="true">
       <xsd:simpleType>
         <xsd:restriction base="dms:Note">
           <xsd:maxLength value="255"/>
         </xsd:restriction>
       </xsd:simpleType>
     </xsd:element>
-    <xsd:element name="MediaServiceGenerationTime" ma:index="14" nillable="true" ma:displayName="MediaServiceGenerationTime" ma:hidden="true" ma:internalName="MediaServiceGenerationTime" ma:readOnly="true">
+    <xsd:element name="MediaServiceLocation" ma:index="20" nillable="true" ma:displayName="Location" ma:description="" ma:indexed="true" ma:internalName="MediaServiceLocation" ma:readOnly="true">
       <xsd:simpleType>
         <xsd:restriction base="dms:Text"/>
       </xsd:simpleType>
     </xsd:element>
-    <xsd:element name="MediaServiceEventHashCode" ma:index="15" nillable="true" ma:displayName="MediaServiceEventHashCode" ma:hidden="true" ma:internalName="MediaServiceEventHashCode" ma:readOnly="true">
+    <xsd:element name="Commentaire" ma:index="21" nillable="true" ma:displayName="Commentaire" ma:description="Notes rapides à prendre en compte" ma:format="Dropdown" ma:internalName="Commentaire">
       <xsd:simpleType>
-        <xsd:restriction base="dms:Text"/>
+        <xsd:restriction base="dms:Note">
+          <xsd:maxLength value="255"/>
+        </xsd:restriction>
       </xsd:simpleType>
     </xsd:element>
-    <xsd:element name="MediaServiceObjectDetectorVersions" ma:index="18" nillable="true" ma:displayName="MediaServiceObjectDetectorVersions" ma:hidden="true" ma:indexed="true" ma:internalName="MediaServiceObjectDetectorVersions" ma:readOnly="true">
-      <xsd:simpleType>
-        <xsd:restriction base="dms:Text"/>
-      </xsd:simpleType>
-    </xsd:element>
-    <xsd:element name="MediaServiceSearchProperties" ma:index="19" nillable="true" ma:displayName="MediaServiceSearchProperties" ma:hidden="true" ma:internalName="MediaServiceSearchProperties" ma:readOnly="true">
+    <xsd:element name="MediaServiceBillingMetadata" ma:index="22" nillable="true" ma:displayName="MediaServiceBillingMetadata" ma:hidden="true" ma:internalName="MediaServiceBillingMetadata" ma:readOnly="true">
       <xsd:simpleType>
         <xsd:restriction base="dms:Note"/>
-      </xsd:simpleType>
-    </xsd:element>
-    <xsd:element name="MediaServiceDateTaken" ma:index="20" nillable="true" ma:displayName="MediaServiceDateTaken" ma:hidden="true" ma:indexed="true" ma:internalName="MediaServiceDateTaken" ma:readOnly="true">
-      <xsd:simpleType>
-        <xsd:restriction base="dms:Text"/>
-      </xsd:simpleType>
-    </xsd:element>
-    <xsd:element name="MediaServiceLocation" ma:index="21" nillable="true" ma:displayName="Location" ma:indexed="true" ma:internalName="MediaServiceLocation" ma:readOnly="true">
-      <xsd:simpleType>
-        <xsd:restriction base="dms:Text"/>
-      </xsd:simpleType>
-    </xsd:element>
-    <xsd:element name="MediaLengthInSeconds" ma:index="22" nillable="true" ma:displayName="MediaLengthInSeconds" ma:hidden="true" ma:internalName="MediaLengthInSeconds" ma:readOnly="true">
-      <xsd:simpleType>
-        <xsd:restriction base="dms:Unknown"/>
       </xsd:simpleType>
     </xsd:element>
   </xsd:schema>
   <xsd:schema xmlns:xsd="http://www.w3.org/2001/XMLSchema" xmlns:xs="http://www.w3.org/2001/XMLSchema" xmlns:dms="http://schemas.microsoft.com/office/2006/documentManagement/types" xmlns:pc="http://schemas.microsoft.com/office/infopath/2007/PartnerControls" targetNamespace="10d26e31-3e6d-4bc1-8210-254c8b5ddd00" elementFormDefault="qualified">
     <xsd:import namespace="http://schemas.microsoft.com/office/2006/documentManagement/types"/>
     <xsd:import namespace="http://schemas.microsoft.com/office/infopath/2007/PartnerControls"/>
-    <xsd:element name="TaxCatchAll" ma:index="12" nillable="true" ma:displayName="Taxonomy Catch All Column" ma:hidden="true" ma:list="{1a1f9e0e-63cb-4182-81cd-d8a1e85f9c9a}" ma:internalName="TaxCatchAll" ma:showField="CatchAllData" ma:web="10d26e31-3e6d-4bc1-8210-254c8b5ddd00">
+    <xsd:element name="TaxCatchAll" ma:index="18" nillable="true" ma:displayName="Taxonomy Catch All Column" ma:hidden="true" ma:list="{1a1f9e0e-63cb-4182-81cd-d8a1e85f9c9a}" ma:internalName="TaxCatchAll" ma:showField="CatchAllData" ma:web="10d26e31-3e6d-4bc1-8210-254c8b5ddd00">
       <xsd:complexType>
         <xsd:complexContent>
           <xsd:extension base="dms:MultiChoiceLookup">
@@ -1462,32 +1668,6 @@
           </xsd:extension>
         </xsd:complexContent>
       </xsd:complexType>
-    </xsd:element>
-    <xsd:element name="SharedWithUsers" ma:index="16" nillable="true" ma:displayName="Partagé avec" ma:internalName="SharedWithUsers" ma:readOnly="true">
-      <xsd:complexType>
-        <xsd:complexContent>
-          <xsd:extension base="dms:UserMulti">
-            <xsd:sequence>
-              <xsd:element name="UserInfo" minOccurs="0" maxOccurs="unbounded">
-                <xsd:complexType>
-                  <xsd:sequence>
-                    <xsd:element name="DisplayName" type="xsd:string" minOccurs="0"/>
-                    <xsd:element name="AccountId" type="dms:UserId" minOccurs="0" nillable="true"/>
-                    <xsd:element name="AccountType" type="xsd:string" minOccurs="0"/>
-                  </xsd:sequence>
-                </xsd:complexType>
-              </xsd:element>
-            </xsd:sequence>
-          </xsd:extension>
-        </xsd:complexContent>
-      </xsd:complexType>
-    </xsd:element>
-    <xsd:element name="SharedWithDetails" ma:index="17" nillable="true" ma:displayName="Partagé avec détails" ma:internalName="SharedWithDetails" ma:readOnly="true">
-      <xsd:simpleType>
-        <xsd:restriction base="dms:Note">
-          <xsd:maxLength value="255"/>
-        </xsd:restriction>
-      </xsd:simpleType>
     </xsd:element>
   </xsd:schema>
   <xsd:schema xmlns="http://schemas.openxmlformats.org/package/2006/metadata/core-properties" xmlns:xsd="http://www.w3.org/2001/XMLSchema" xmlns:xsi="http://www.w3.org/2001/XMLSchema-instance" xmlns:dc="http://purl.org/dc/elements/1.1/" xmlns:dcterms="http://purl.org/dc/terms/" xmlns:odoc="http://schemas.microsoft.com/internal/obd" targetNamespace="http://schemas.openxmlformats.org/package/2006/metadata/core-properties" elementFormDefault="qualified" attributeFormDefault="unqualified" blockDefault="#all">
@@ -1589,33 +1769,35 @@
 </ct:contentTypeSchema>
 </file>
 
+<file path=customXml/item2.xml><?xml version="1.0" encoding="utf-8"?>
+<?mso-contentType ?>
+<FormTemplates xmlns="http://schemas.microsoft.com/sharepoint/v3/contenttype/forms">
+  <Display>DocumentLibraryForm</Display>
+  <Edit>DocumentLibraryForm</Edit>
+  <New>DocumentLibraryForm</New>
+</FormTemplates>
+</file>
+
 <file path=customXml/item3.xml><?xml version="1.0" encoding="utf-8"?>
 <p:properties xmlns:p="http://schemas.microsoft.com/office/2006/metadata/properties" xmlns:xsi="http://www.w3.org/2001/XMLSchema-instance" xmlns:pc="http://schemas.microsoft.com/office/infopath/2007/PartnerControls">
   <documentManagement>
     <TaxCatchAll xmlns="10d26e31-3e6d-4bc1-8210-254c8b5ddd00" xsi:nil="true"/>
-    <lcf76f155ced4ddcb4097134ff3c332f xmlns="ceb1f4d8-00b6-4797-bbe4-8df8d1483779">
+    <lcf76f155ced4ddcb4097134ff3c332f xmlns="79897123-3b52-4ad2-92b6-660dc1d292e7">
       <Terms xmlns="http://schemas.microsoft.com/office/infopath/2007/PartnerControls"/>
     </lcf76f155ced4ddcb4097134ff3c332f>
+    <Commentaire xmlns="79897123-3b52-4ad2-92b6-660dc1d292e7" xsi:nil="true"/>
   </documentManagement>
 </p:properties>
 </file>
 
 <file path=customXml/itemProps1.xml><?xml version="1.0" encoding="utf-8"?>
-<ds:datastoreItem xmlns:ds="http://schemas.openxmlformats.org/officeDocument/2006/customXml" ds:itemID="{9404DFD2-5AD0-4E83-98A7-C31F4D4AA841}">
-  <ds:schemaRefs>
-    <ds:schemaRef ds:uri="http://schemas.microsoft.com/sharepoint/v3/contenttype/forms"/>
-  </ds:schemaRefs>
-</ds:datastoreItem>
-</file>
-
-<file path=customXml/itemProps2.xml><?xml version="1.0" encoding="utf-8"?>
-<ds:datastoreItem xmlns:ds="http://schemas.openxmlformats.org/officeDocument/2006/customXml" ds:itemID="{A9171A8B-B7D5-4614-977F-6768B99563C4}">
+<ds:datastoreItem xmlns:ds="http://schemas.openxmlformats.org/officeDocument/2006/customXml" ds:itemID="{2C476936-D48C-4C3E-A65C-488FE83D2918}">
   <ds:schemaRefs>
     <ds:schemaRef ds:uri="http://schemas.microsoft.com/office/2006/metadata/contentType"/>
     <ds:schemaRef ds:uri="http://schemas.microsoft.com/office/2006/metadata/properties/metaAttributes"/>
     <ds:schemaRef ds:uri="http://www.w3.org/2001/XMLSchema"/>
     <ds:schemaRef ds:uri="http://schemas.microsoft.com/office/2006/metadata/properties"/>
-    <ds:schemaRef ds:uri="ceb1f4d8-00b6-4797-bbe4-8df8d1483779"/>
+    <ds:schemaRef ds:uri="79897123-3b52-4ad2-92b6-660dc1d292e7"/>
     <ds:schemaRef ds:uri="10d26e31-3e6d-4bc1-8210-254c8b5ddd00"/>
     <ds:schemaRef ds:uri="http://schemas.microsoft.com/office/2006/documentManagement/types"/>
     <ds:schemaRef ds:uri="http://schemas.microsoft.com/office/infopath/2007/PartnerControls"/>
@@ -1627,13 +1809,21 @@
 </ds:datastoreItem>
 </file>
 
+<file path=customXml/itemProps2.xml><?xml version="1.0" encoding="utf-8"?>
+<ds:datastoreItem xmlns:ds="http://schemas.openxmlformats.org/officeDocument/2006/customXml" ds:itemID="{9404DFD2-5AD0-4E83-98A7-C31F4D4AA841}">
+  <ds:schemaRefs>
+    <ds:schemaRef ds:uri="http://schemas.microsoft.com/sharepoint/v3/contenttype/forms"/>
+  </ds:schemaRefs>
+</ds:datastoreItem>
+</file>
+
 <file path=customXml/itemProps3.xml><?xml version="1.0" encoding="utf-8"?>
 <ds:datastoreItem xmlns:ds="http://schemas.openxmlformats.org/officeDocument/2006/customXml" ds:itemID="{024BE3F7-3AF2-450E-827C-2EEB200F3D01}">
   <ds:schemaRefs>
     <ds:schemaRef ds:uri="http://schemas.microsoft.com/office/2006/metadata/properties"/>
     <ds:schemaRef ds:uri="http://schemas.microsoft.com/office/infopath/2007/PartnerControls"/>
     <ds:schemaRef ds:uri="10d26e31-3e6d-4bc1-8210-254c8b5ddd00"/>
-    <ds:schemaRef ds:uri="ceb1f4d8-00b6-4797-bbe4-8df8d1483779"/>
+    <ds:schemaRef ds:uri="79897123-3b52-4ad2-92b6-660dc1d292e7"/>
   </ds:schemaRefs>
 </ds:datastoreItem>
 </file>
</xml_diff>